<commit_message>
Add Masav board service and expand hero layout
</commit_message>
<xml_diff>
--- a/docs/website-content-review.docx
+++ b/docs/website-content-review.docx
@@ -4889,6 +4889,293 @@
       </w:tr>
     </w:tbl>
     <w:p/>
+    <w:tbl>
+      <w:tblPr>
+        <w:tblStyle w:val="TableGrid"/>
+        <w:tblW w:type="auto" w:w="0"/>
+        <w:jc w:val="right"/>
+        <w:tblLook w:firstColumn="1" w:firstRow="1" w:lastColumn="0" w:lastRow="0" w:noHBand="0" w:noVBand="1" w:val="04A0"/>
+      </w:tblPr>
+      <w:tblGrid>
+        <w:gridCol w:w="5270"/>
+        <w:gridCol w:w="5270"/>
+      </w:tblGrid>
+      <w:tr>
+        <w:tc>
+          <w:tcPr>
+            <w:tcW w:type="dxa" w:w="5270"/>
+            <w:vAlign w:val="center"/>
+            <w:shd w:fill="EAF1F8"/>
+          </w:tcPr>
+          <w:p>
+            <w:pPr>
+              <w:spacing w:after="120"/>
+              <w:jc w:val="right"/>
+              <w:bidi/>
+            </w:pPr>
+            <w:r/>
+            <w:r>
+              <w:rPr>
+                <w:rFonts w:ascii="Arial" w:hAnsi="Arial"/>
+                <w:b/>
+                <w:color w:val="334BB8"/>
+                <w:sz w:val="18"/>
+              </w:rPr>
+              <w:t>נוסח חדש / תיקון</w:t>
+            </w:r>
+          </w:p>
+        </w:tc>
+        <w:tc>
+          <w:tcPr>
+            <w:tcW w:type="dxa" w:w="5270"/>
+            <w:vAlign w:val="center"/>
+          </w:tcPr>
+          <w:p>
+            <w:pPr>
+              <w:spacing w:after="120"/>
+              <w:jc w:val="right"/>
+              <w:bidi/>
+            </w:pPr>
+            <w:r/>
+            <w:r>
+              <w:rPr>
+                <w:rFonts w:ascii="Arial" w:hAnsi="Arial"/>
+                <w:b w:val="0"/>
+                <w:color w:val="64748B"/>
+                <w:sz w:val="18"/>
+              </w:rPr>
+            </w:r>
+          </w:p>
+        </w:tc>
+      </w:tr>
+      <w:tr>
+        <w:tc>
+          <w:tcPr>
+            <w:tcW w:type="dxa" w:w="5270"/>
+            <w:vAlign w:val="center"/>
+            <w:shd w:fill="EAF1F8"/>
+          </w:tcPr>
+          <w:p>
+            <w:pPr>
+              <w:spacing w:after="120"/>
+              <w:jc w:val="right"/>
+              <w:bidi/>
+            </w:pPr>
+            <w:r/>
+            <w:r>
+              <w:rPr>
+                <w:rFonts w:ascii="Arial" w:hAnsi="Arial"/>
+                <w:b/>
+                <w:color w:val="334BB8"/>
+                <w:sz w:val="18"/>
+              </w:rPr>
+              <w:t>הערת תוכן או עובדה</w:t>
+            </w:r>
+          </w:p>
+        </w:tc>
+        <w:tc>
+          <w:tcPr>
+            <w:tcW w:type="dxa" w:w="5270"/>
+            <w:vAlign w:val="center"/>
+          </w:tcPr>
+          <w:p>
+            <w:pPr>
+              <w:spacing w:after="120"/>
+              <w:jc w:val="right"/>
+              <w:bidi/>
+            </w:pPr>
+            <w:r/>
+            <w:r>
+              <w:rPr>
+                <w:rFonts w:ascii="Arial" w:hAnsi="Arial"/>
+                <w:b w:val="0"/>
+                <w:color w:val="64748B"/>
+                <w:sz w:val="18"/>
+              </w:rPr>
+            </w:r>
+          </w:p>
+        </w:tc>
+      </w:tr>
+      <w:tr>
+        <w:tc>
+          <w:tcPr>
+            <w:tcW w:type="dxa" w:w="5270"/>
+            <w:vAlign w:val="center"/>
+            <w:shd w:fill="EAF1F8"/>
+          </w:tcPr>
+          <w:p>
+            <w:pPr>
+              <w:spacing w:after="120"/>
+              <w:jc w:val="right"/>
+              <w:bidi/>
+            </w:pPr>
+            <w:r/>
+            <w:r>
+              <w:rPr>
+                <w:rFonts w:ascii="Arial" w:hAnsi="Arial"/>
+                <w:b/>
+                <w:color w:val="334BB8"/>
+                <w:sz w:val="18"/>
+              </w:rPr>
+              <w:t>הערה ויזואלית / UX</w:t>
+            </w:r>
+          </w:p>
+        </w:tc>
+        <w:tc>
+          <w:tcPr>
+            <w:tcW w:type="dxa" w:w="5270"/>
+            <w:vAlign w:val="center"/>
+          </w:tcPr>
+          <w:p>
+            <w:pPr>
+              <w:spacing w:after="120"/>
+              <w:jc w:val="right"/>
+              <w:bidi/>
+            </w:pPr>
+            <w:r/>
+            <w:r>
+              <w:rPr>
+                <w:rFonts w:ascii="Arial" w:hAnsi="Arial"/>
+                <w:b w:val="0"/>
+                <w:color w:val="64748B"/>
+                <w:sz w:val="18"/>
+              </w:rPr>
+            </w:r>
+          </w:p>
+        </w:tc>
+      </w:tr>
+    </w:tbl>
+    <w:p/>
+    <w:p>
+      <w:pPr>
+        <w:pStyle w:val="Heading2"/>
+        <w:spacing w:after="120"/>
+        <w:jc w:val="right"/>
+        <w:bidi/>
+      </w:pPr>
+      <w:r>
+        <w:rPr>
+          <w:rFonts w:ascii="Arial" w:hAnsi="Arial"/>
+          <w:color w:val="18243A"/>
+        </w:rPr>
+        <w:t>2024 - 2026 | דירקטור</w:t>
+      </w:r>
+    </w:p>
+    <w:p>
+      <w:pPr>
+        <w:spacing w:after="120"/>
+        <w:ind w:right="0"/>
+        <w:jc w:val="right"/>
+        <w:bidi/>
+      </w:pPr>
+      <w:r>
+        <w:rPr>
+          <w:rFonts w:ascii="Arial" w:hAnsi="Arial"/>
+          <w:b/>
+          <w:color w:val="15936A"/>
+          <w:sz w:val="20"/>
+        </w:rPr>
+        <w:t>מס״ב - מרכז סליקה בנקאי | תשתיות פיננסיות וסליקה בנקאית</w:t>
+      </w:r>
+    </w:p>
+    <w:p>
+      <w:pPr>
+        <w:spacing w:after="120"/>
+        <w:ind w:right="0"/>
+        <w:jc w:val="right"/>
+        <w:bidi/>
+      </w:pPr>
+      <w:r>
+        <w:rPr>
+          <w:rFonts w:ascii="Arial" w:hAnsi="Arial"/>
+          <w:b w:val="0"/>
+          <w:color w:val="64748B"/>
+          <w:sz w:val="18"/>
+        </w:rPr>
+        <w:t>תגית באתר: דירקטוריון</w:t>
+      </w:r>
+    </w:p>
+    <w:p>
+      <w:pPr>
+        <w:spacing w:after="120"/>
+        <w:ind w:right="0"/>
+        <w:jc w:val="right"/>
+        <w:bidi/>
+      </w:pPr>
+      <w:r>
+        <w:rPr>
+          <w:rFonts w:ascii="Arial" w:hAnsi="Arial"/>
+          <w:b/>
+          <w:sz w:val="20"/>
+        </w:rPr>
+        <w:t>תמצית מנהלים באתר</w:t>
+      </w:r>
+    </w:p>
+    <w:p>
+      <w:pPr>
+        <w:spacing w:after="120"/>
+        <w:ind w:right="0"/>
+        <w:jc w:val="right"/>
+        <w:bidi/>
+      </w:pPr>
+      <w:r>
+        <w:rPr>
+          <w:rFonts w:ascii="Arial" w:hAnsi="Arial"/>
+          <w:b w:val="0"/>
+          <w:sz w:val="20"/>
+        </w:rPr>
+        <w:t>כהונה כדירקטור במס״ב - מרכז סליקה בנקאי, לצד תפקידי הניהול הבכירים בבנק לאומי.</w:t>
+      </w:r>
+    </w:p>
+    <w:p>
+      <w:pPr>
+        <w:spacing w:after="120"/>
+        <w:ind w:right="0"/>
+        <w:jc w:val="right"/>
+        <w:bidi/>
+      </w:pPr>
+      <w:r>
+        <w:rPr>
+          <w:rFonts w:ascii="Arial" w:hAnsi="Arial"/>
+          <w:b/>
+          <w:sz w:val="20"/>
+        </w:rPr>
+        <w:t>פירוט מלא (נפתח בלחיצה באתר)</w:t>
+      </w:r>
+    </w:p>
+    <w:p>
+      <w:pPr>
+        <w:spacing w:after="120"/>
+        <w:ind w:right="198"/>
+        <w:jc w:val="right"/>
+        <w:bidi/>
+      </w:pPr>
+      <w:r>
+        <w:rPr>
+          <w:rFonts w:ascii="Arial" w:hAnsi="Arial"/>
+          <w:b w:val="0"/>
+          <w:sz w:val="20"/>
+        </w:rPr>
+        <w:t>• דירקטור במס״ב - מרכז סליקה בנקאי, בשנים 2024-2026.</w:t>
+      </w:r>
+    </w:p>
+    <w:p>
+      <w:pPr>
+        <w:spacing w:after="120"/>
+        <w:ind w:right="0"/>
+        <w:jc w:val="right"/>
+        <w:bidi/>
+      </w:pPr>
+      <w:r>
+        <w:rPr>
+          <w:rFonts w:ascii="Arial" w:hAnsi="Arial"/>
+          <w:b w:val="0"/>
+          <w:color w:val="64748B"/>
+          <w:sz w:val="18"/>
+        </w:rPr>
+        <w:t>תגיות באתר: דירקטוריון, תשתיות פיננסיות, סליקה בנקאית, Governance</w:t>
+      </w:r>
+    </w:p>
     <w:tbl>
       <w:tblPr>
         <w:tblStyle w:val="TableGrid"/>

</xml_diff>

<commit_message>
Apply reviewed CV content updates
</commit_message>
<xml_diff>
--- a/docs/website-content-review.docx
+++ b/docs/website-content-review.docx
@@ -556,7 +556,7 @@
           <w:b w:val="0"/>
           <w:sz w:val="20"/>
         </w:rPr>
-        <w:t>Chief AI Officer (CAIO) | מנהיג טכנולוגיה, חדשנות וטרנספורמציה דיגיטלית</w:t>
+        <w:t>מנהל בכיר המחבר בין עסק, טכנולוגיה, דאטה ואנשים | הובלת חדשנות, טרנספורמציה דיגיטלית ו-AI - מגיבוש אסטרטגיה עסקית וטכנולוגית דרך יישום בפועל והובלת שינוי ארגוני ועד אימוץ והשפעה עסקית</w:t>
       </w:r>
     </w:p>
     <w:tbl>
@@ -747,6 +747,14 @@
           <w:sz w:val="20"/>
         </w:rPr>
         <w:t>מקום 1 בישראל באימוץ AI (מדד Evident AI 2026) | בנק לאומי</w:t>
+        <w:br/>
+        <w:t>יחס יעילות מוביל במערכת הבנקאית בישראל</w:t>
+        <w:br/>
+        <w:t>הובלת טרנספורמציית AI חוצת בנק עם השפעה עסקית ותפעולית רחבה</w:t>
+        <w:br/>
+        <w:t>שינוי ה-DNA הארגוני והפיכת AI לחלק משיטת העבודה והתרבות הארגונית</w:t>
+        <w:br/>
+        <w:t>השפעה עסקית מוכחת: שיפור שירות וחוויית לקוח, צמיחה במכירות ובהמרות, התייעלות והגדלת פרודוקטיביות</w:t>
       </w:r>
     </w:p>
     <w:tbl>
@@ -936,7 +944,13 @@
           <w:b w:val="0"/>
           <w:sz w:val="20"/>
         </w:rPr>
-        <w:t>מנהל בכיר בעל מעל 20 שנות ניסיון רב-תחומי, המשלב ראייה אסטרטגית עסקית רחבה עם מומחיות טכנולוגית מעמיקה (כולל Hands-on). הובלת מרכז ה-AI של בנק לאומי בכפיפות ישירה למנכ״ל, ניהול אגפים ויחידות P&amp;L בהיקפי עשרות מיליוני שקלים, ניהול קרן הון סיכון (Irani Ventures), ודירקטוריונים.</w:t>
+        <w:t>הובלת חדשנות, טרנספורמציה דיגיטלית ו-AI - מגיבוש אסטרטגיה עסקית וטכנולוגית דרך יישום בפועל והובלת שינוי ארגוני ועד אימוץ והשפעה עסקית.</w:t>
+        <w:br/>
+        <w:br/>
+        <w:t>לאורך יותר משני עשורים מילאתי תפקידי ניהול, טכנולוגיה, חדשנות ועסקים במגוון רחב של ארגונים ותעשיות: מפיננסים, ביטוח ורפואה ועד Retail, טלקום והייטק. הניסיון הזה מאפשר לי להביא לכל אתגר פרספקטיבה רחבה, לחבר בין עולמות וליישם תובנות ופתרונות מתחום אחד באחר.</w:t>
+        <w:br/>
+        <w:br/>
+        <w:t>במהלך הקריירה ניהלתי יחידות טכנולוגיות ועסקיות, אגפי P&amp;L בהיקפים של מאות מיליוני שקלים, פעילות השקעות וחדשנות ודירקטוריונים, ובשנים האחרונות הובלתי בבנק לאומי מהלכי טרנספורמציה רחבי היקף ואת מרכז ה-AI בכפיפות ישירה למנכ״ל. אני משלב ראייה ניהולית ואסטרטגית עם הבנה טכנולוגית עמוקה ויכולת Hands-on, ויודע לקחת רעיון או יעד עסקי, להפוך אותו לתכנית מעשית ולהוביל אותו עד ליישום ולתוצאה.</w:t>
       </w:r>
     </w:p>
     <w:tbl>
@@ -1696,7 +1710,7 @@
           <w:b w:val="0"/>
           <w:sz w:val="20"/>
         </w:rPr>
-        <w:t>קראו גם על האדם שמאחורי המסע | משפחה, ערכים והדרך האישית</w:t>
+        <w:t>מי אני מחוץ לעבודה | קצת יותר אישי</w:t>
       </w:r>
     </w:p>
     <w:tbl>
@@ -4281,7 +4295,7 @@
           <w:b w:val="0"/>
           <w:sz w:val="20"/>
         </w:rPr>
-        <w:t>הקמה והובלה של מרכז ה-AI של בנק לאומי, גיבוש אסטרטגיית AI ארגונית הוליסטית, הקמת AI Board בראשות המנכ״ל, והובלת טרנספורמציית Generative &amp; Agentic AI בכלל זרועות הבנק שהובילה לדירוג לאומי במקום ה-1 בישראל באימוץ AI (מדד Evident AI).</w:t>
+        <w:t>הקמה והובלה של מרכז ה-AI של בנק לאומי, גיבוש אסטרטגיית AI ארגונית הוליסטית, גיבוש תהליכי עבודה והקמת פורומים שונים כולל AI Board בראשות המנכ״ל, והובלת טרנספורמציית Generative &amp; Agentic AI בכלל זרועות הבנק שהובילה בין השאר לדירוג לאומי במקום ה-1 בישראל באימוץ AI (מדד Evident AI) וליחס היעילות הטוב במערכת הבנקאית בארץ.</w:t>
       </w:r>
     </w:p>
     <w:p>
@@ -4377,7 +4391,7 @@
           <w:b w:val="0"/>
           <w:sz w:val="20"/>
         </w:rPr>
-        <w:t>• יצירת השפעה עסקית ותפעולית מדידה: פריסת צ׳אט AI לכלל לקוחות הבנק בדיגיטל עם ירידה של כ-10% בפניות הכתובות לבנקאי ללא עלייה בהיקף השיחות למוקד; פתרונות תמלול ו-AI שהביאו לקיצור של כ-15%-20% בזמני טיפול ולירידה של כ-95% בשגיאות תיעוד; והובלת AI-Driven SDLC עם יעד של לפחות 20% שיפור בפרודוקטיביות.</w:t>
+        <w:t>• יצירת השפעה עסקית ותפעולית מדידה: למשל פריסת צ׳אט AI לכלל לקוחות הבנק בדיגיטל עם ירידה של כ-15% בפניות הכתובות לבנקאי ללא עלייה בהיקף השיחות למוקד; פתרונות תמלול ו-AI שהביאו לקיצור של כ-15%-20% בזמני טיפול ולירידה של כ-95% בשגיאות תיעוד; והובלת AI-Driven SDLC עם יעד של כ-20% שיפור בתהליך הפיתוח.</w:t>
       </w:r>
     </w:p>
     <w:p>
@@ -5124,7 +5138,7 @@
           <w:b w:val="0"/>
           <w:sz w:val="20"/>
         </w:rPr>
-        <w:t>כהונה כדירקטור במס״ב - מרכז סליקה בנקאי, לצד תפקידי הניהול הבכירים בבנק לאומי.</w:t>
+        <w:t>כהונה כדירקטור במס״ב - מרכז סליקה בנקאי, לצד תפקידי הניהול בבנק לאומי.</w:t>
       </w:r>
     </w:p>
     <w:p>
@@ -5156,7 +5170,7 @@
           <w:b w:val="0"/>
           <w:sz w:val="20"/>
         </w:rPr>
-        <w:t>• דירקטור במס״ב - מרכז סליקה בנקאי, בשנים 2024-2026.</w:t>
+        <w:t>• דירקטור במס״ב - מרכז סליקה בנקאי, לצד תפקידי הניהול בבנק לאומי.</w:t>
       </w:r>
     </w:p>
     <w:p>
@@ -5345,7 +5359,7 @@
           <w:rFonts w:ascii="Arial" w:hAnsi="Arial"/>
           <w:color w:val="18243A"/>
         </w:rPr>
-        <w:t>2023 - 2025 | ראש אגף ערוצים, טכנולוגיות שוקי הון וטכנולוגיות רוחביות</w:t>
+        <w:t>2023 - 2025 | ראש אגף ערוצים, טכנו׳ שוקי הון וטכנולוגיות רוחביות</w:t>
       </w:r>
     </w:p>
     <w:p>
@@ -5411,7 +5425,7 @@
           <w:b w:val="0"/>
           <w:sz w:val="20"/>
         </w:rPr>
-        <w:t>ניהול אגף טכנולוגי רחב ואחריות End-to-End על Product, Technology &amp; Delivery בתחומי ה-Omnichannel, Salesforce Enterprise, טכנולוגיות שוקי הון (אפליקציית Trade), Contact Center מודרני (CCaaS), ומערך השירותים האוטומטיים.</w:t>
+        <w:t>ניהול אגף טכנולוגי רחב ואחריות End-to-End על Product, Technology &amp; Delivery בתחומי ה-Omnichannel, Salesforce Enterprise, טכנולוגיות שוקי הון (ליבה ודיגיטל), Contact Center ורב-ערוציות, ומערך השירותים האוטומטיים.</w:t>
       </w:r>
     </w:p>
     <w:p>
@@ -5443,7 +5457,7 @@
           <w:b w:val="0"/>
           <w:sz w:val="20"/>
         </w:rPr>
-        <w:t>• ניהול אגף טכנולוגי רחב ואחריות End-to-End על Product, Technology &amp; Delivery בתחומים אסטרטגיים בבנק: מערך הערוצים והרב-ערוציות, Salesforce, טכנולוגיות שוקי הון ופלטפורמות טכנולוגיות רוחביות.</w:t>
+        <w:t>• ניהול אגף טכנולוגי רחב ואחריות End-to-End על Product, Technology &amp; Delivery בתחומים אסטרטגיים בבנק: מערך הערוצים והרב-ערוציות, Salesforce, מסעות לקוח, טכנולוגיות שוקי הון (ליבה ודיגיטל) ופלטפורמות טכנולוגיות רוחביות.</w:t>
       </w:r>
     </w:p>
     <w:p>
@@ -5475,7 +5489,7 @@
           <w:b w:val="0"/>
           <w:sz w:val="20"/>
         </w:rPr>
-        <w:t>• הובלת מהלך אסטרטגי למודרניזציה של ה-Contact Center, לרבות גיבוש תפיסת היעד והארכיטקטורה והובלת RFP להחלפת הפלטפורמה הקיימת בפתרון CCaaS, משלב הגדרת הדרישות ובחינת החלופות ועד להיערכות למימוש.</w:t>
+        <w:t>• הובלת מהלך אסטרטגי למודרניזציה של ה-Contact Center, לרבות גיבוש תפיסת היעד הן מהיבטי תפיסת שירות ומכירה והן מהיבטים טכנולוגיים ובכלל זה הארכיטקטורה, והובלת RFP להחלפת הפלטפורמה הקיימת בפתרון CCaaS, משלב הגדרת הדרישות ובחינת החלופות ועד להיערכות למימוש.</w:t>
       </w:r>
     </w:p>
     <w:p>
@@ -5523,7 +5537,7 @@
           <w:b w:val="0"/>
           <w:sz w:val="20"/>
         </w:rPr>
-        <w:t>• ניהול פורטפוליו של פלטפורמות וטכנולוגיות רוחביות המשרתות חטיבות ותהליכים רבים בבנק, ובהן מערכות BPM וניהול תהליכים, מערכות כגון FreeForm ו-Docomotion, כלי תיוק וארכיון, ומערכת לניהול הודעות ללקוחות בערוצים השונים והחוקה.</w:t>
+        <w:t>• ניהול פורטפוליו של פלטפורמות וטכנולוגיות רוחביות המשרתות חטיבות ותהליכים רבים בבנק, ובהן מערכות BPM וניהול תהליכים, כלי תיוק וארכיון, מערכת לניהול הודעות ללקוחות בערוצים השונים והחוקה ועוד.</w:t>
       </w:r>
     </w:p>
     <w:p>
@@ -6341,7 +6355,7 @@
           <w:b w:val="0"/>
           <w:sz w:val="20"/>
         </w:rPr>
-        <w:t>ניהול כולל של חטיבת הטכנולוגיות וקרן ההון סיכון התאגידית (Irani Ventures), חבר בדירקטוריון המצומצם של הקבוצה, הובלת השקעות בסטארטאפים בתחום ה-Retail Tech, יצירת סינרגיות עסקיות ועבודה מול C-Level של מותגי יוקרה בינלאומיים.</w:t>
+        <w:t>ניהול כולל של חטיבת הטכנולוגיות וקרן ההון סיכון (Irani Ventures), חבר בדירקטוריון המצומצם של הקבוצה, הובלת השקעות בסטארטאפים בתחום ה-Retail Tech, יצירת סינרגיות עסקיות ועבודה מול C-Level של מותגי יוקרה בינלאומיים.</w:t>
       </w:r>
     </w:p>
     <w:p>
@@ -6373,7 +6387,7 @@
           <w:b w:val="0"/>
           <w:sz w:val="20"/>
         </w:rPr>
-        <w:t>• אחראי על כלל ההיבטים הטכנולוגיים והתהליכיים (או"ש) בקבוצה בדגש על דיגיטל, דאטה וחדשנות עסקית.</w:t>
+        <w:t>• אחראי על כלל ההיבטים הטכנולוגיים והתהליכיים בקבוצה בדגש על דיגיטל, דאטה וחדשנות עסקית.</w:t>
       </w:r>
     </w:p>
     <w:p>
@@ -7168,7 +7182,7 @@
           <w:b w:val="0"/>
           <w:sz w:val="20"/>
         </w:rPr>
-        <w:t>הובלת טרנספורמציה דיגיטלית מלאה שהפכה את החברה ל-Data-Driven מבוססת AI/ML, ניהול כלל מערך התשתיות, פיתוח R&amp;D, דאטה, eCommerce, הטמעת טכנולוגיית חיישני Nano BLE של Wiliot ברצפת המכירה, והרצאות מרכזיות בכנסים בינלאומיים.</w:t>
+        <w:t>הובלת טרנספורמציה דיגיטלית מלאה שהפכה את החברה ל-Data-Driven מבוססת AI/ML, ניהול כלל מערך התשתיות, פיתוח R&amp;D, דאטה, eCommerce והרצאות מרכזיות בכנסים בינלאומיים.</w:t>
       </w:r>
     </w:p>
     <w:p>
@@ -8233,7 +8247,7 @@
           <w:b w:val="0"/>
           <w:sz w:val="20"/>
         </w:rPr>
-        <w:t>• ניהול תקציב של עשרות מיליוני ש"ח, הובלת מו"מ וחוזים מול ספקים גדולים.</w:t>
+        <w:t>• ניהול תקציב של מאות מיליוני ש"ח, הובלת מו"מ וחוזים מול ספקים גדולים.</w:t>
       </w:r>
     </w:p>
     <w:p>
@@ -8520,6 +8534,22 @@
           <w:b w:val="0"/>
           <w:sz w:val="20"/>
         </w:rPr>
+        <w:t>• שותף בצוות ההקמה שעיצב את החברה, פעילותה והכיוון העסקי מראשיתה.</w:t>
+      </w:r>
+    </w:p>
+    <w:p>
+      <w:pPr>
+        <w:spacing w:after="120"/>
+        <w:ind w:right="198"/>
+        <w:jc w:val="right"/>
+        <w:bidi/>
+      </w:pPr>
+      <w:r>
+        <w:rPr>
+          <w:rFonts w:ascii="Arial" w:hAnsi="Arial"/>
+          <w:b w:val="0"/>
+          <w:sz w:val="20"/>
+        </w:rPr>
         <w:t>• ניהול כל קו המוצרים והפתרונות של החברה בכלל זה הטכנולוגיה, תהליכי השיווק, המכירה, ההטמעה והשירות שלהם.</w:t>
       </w:r>
     </w:p>
@@ -8839,7 +8869,7 @@
           <w:b w:val="0"/>
           <w:sz w:val="20"/>
         </w:rPr>
-        <w:t>• ניהול יחידה עסקית מקצה לקצה, P&amp;L, בהיקף מחזור מכירות של כ-20 מיליון ₪ בשנה.</w:t>
+        <w:t>• ניהול יחידה עסקית מקצה לקצה, P&amp;L, בהיקף מחזור מכירות של עשרות מיליוני ₪ בשנה.</w:t>
       </w:r>
     </w:p>
     <w:p>
@@ -9485,7 +9515,7 @@
           <w:b w:val="0"/>
           <w:sz w:val="20"/>
         </w:rPr>
-        <w:t>• ניהול תקציב בהיקף של כ-30 מיליון ₪ וניהול מו"מ מול חברות ענק כמו Oracle, HP, Microsoft וכו'.</w:t>
+        <w:t>• ניהול תקציב בהיקף של עשרות מיליוני ₪ וניהול מו"מ מול חברות ענק כמו Oracle, HP, Microsoft וכו'.</w:t>
       </w:r>
     </w:p>
     <w:p>
@@ -13323,7 +13353,7 @@
           <w:b/>
           <w:sz w:val="22"/>
         </w:rPr>
-        <w:t>2004 - 2008 | B.Sc בהנדסת תוכנה בהצטיינות (Summa Cum Laude)</w:t>
+        <w:t>2004 - 2008 | B.Sc בהנדסת תוכנה בהצטיינות</w:t>
       </w:r>
     </w:p>
     <w:p>
@@ -14168,7 +14198,7 @@
           <w:b w:val="0"/>
           <w:sz w:val="20"/>
         </w:rPr>
-        <w:t>מעבר לטכנולוגיות פורצות דרך, ארכיטקטורות ענן וסוכני AI – בבסיס של כל הצלחה עסקית עומדים אנשים, ערכים ואמון. המנהיגות שלי נשענת על גישה אנושית בגובה העיניים, חיבור עמוק לצוותים, העצמת מנהלים ויצירת סביבה שבה חדשנות ויצירתיות יכולות לשגשג.</w:t>
+        <w:t>מעבר לטכנולוגיות פורצות דרך, ארכיטקטורות ענן וסוכני AI – בבסיס של כל הצלחה עסקית עומדים אנשים, ערכים ואמון. אני מנהל עם גישה אנושית בגובה העיניים, חיבור עמוק לצוותים, העצמת מנהלים ויצירת סביבה שבה חדשנות ויצירתיות יכולות לשגשג.</w:t>
       </w:r>
     </w:p>
     <w:tbl>
@@ -14341,7 +14371,7 @@
           <w:b w:val="0"/>
           <w:sz w:val="20"/>
         </w:rPr>
-        <w:t>העוגן המשמעותי והחשוב ביותר בחיי הוא המשפחה שלי. הם מקור ההשראה, הכוח והאיזון שלי שמאפשר לי להוביל מהלכים בקנה מידה לאומי, לקבל החלטות אסטרטגיות מורכבות תחת לחץ ולשמור תמיד על חדות, חום אנושי ואופטימיות.</w:t>
+        <w:t>המשפחה שלי היא הכוח שמאחוריי וזו שמאפשרת לי להוביל מהלכים בקנה מידה כזה, לקבל החלטות אסטרטגיות מורכבות תחת לחץ ולשמור תמיד על חדות, אנושיות ואופטימיות.</w:t>
       </w:r>
     </w:p>
     <w:tbl>
@@ -14514,7 +14544,7 @@
           <w:b w:val="0"/>
           <w:sz w:val="20"/>
         </w:rPr>
-        <w:t>במקביל לעשייה הניהולית והטכנולוגית, אני רואה שליחות גדולה בהעברת ידע וטיפוח דור העתיד – כמרצה למדעי המחשב בעברי וכמנטור ושופט בבית הספר ליזמות של אוניברסיטת רייכמן מזה למעלה מעשור.</w:t>
+        <w:t>במקביל לעשייה הניהולית והטכנולוגית, אני רואה שליחות גדולה בתרומה לקהילה ובהעברת ידע וטיפוח דור העתיד.</w:t>
       </w:r>
     </w:p>
     <w:tbl>
@@ -15098,7 +15128,7 @@
           <w:b w:val="0"/>
           <w:sz w:val="20"/>
         </w:rPr>
-        <w:t>מחייך, ומודה בכל יום על המשפחה שהיא העוגן והכוח שמאחורי הדרך.</w:t>
+        <w:t>כתבתי מספיק על עצמי</w:t>
       </w:r>
     </w:p>
     <w:tbl>
@@ -15287,7 +15317,7 @@
           <w:b w:val="0"/>
           <w:sz w:val="20"/>
         </w:rPr>
-        <w:t>ליבי הבן, בן 10 - הצעיר שלנו, עם שם שאנשים נוטים בטעות לייחס לבת.</w:t>
+        <w:t>ליבי ״הבן״, בן 10 - הצעיר שלנו, ששומר גם אותנו צעירים.</w:t>
       </w:r>
     </w:p>
     <w:tbl>

</xml_diff>